<commit_message>
finished my self evaluation
</commit_message>
<xml_diff>
--- a/Docs/Self Assessments/Project Self-Evaluation Evelien de Wals.docx
+++ b/Docs/Self Assessments/Project Self-Evaluation Evelien de Wals.docx
@@ -830,7 +830,7 @@
           <w:lang w:eastAsia="en-GB"/>
           <w14:ligatures w14:val="none"/>
         </w:rPr>
-        <w:t>☐</w:t>
+        <w:t>X</w:t>
       </w:r>
       <w:r>
         <w:rPr>
@@ -1122,13 +1122,11 @@
         <w:pStyle w:val="NormalWeb"/>
       </w:pPr>
       <w:r>
-        <w:t xml:space="preserve">I was team lead </w:t>
-      </w:r>
-      <w:proofErr w:type="gramStart"/>
-      <w:r>
-        <w:t>an</w:t>
-      </w:r>
-      <w:proofErr w:type="gramEnd"/>
+        <w:t>I was team lead an</w:t>
+      </w:r>
+      <w:r>
+        <w:t>d</w:t>
+      </w:r>
       <w:r>
         <w:t xml:space="preserve"> believed I showed that quite well, I took ownership over tasks and tried to pay attention to detail and quality though I feel like the quality didn’t really show because of my lacking hard skills. I did always try my best to help the group and came up with a lot of ideas. I tried to be highly productive Aswell though I feel like this didn’t show because I do struggle with the hard skills and get discouraged sometimes.</w:t>
       </w:r>
@@ -2195,7 +2193,29 @@
           <w:lang w:eastAsia="en-GB"/>
           <w14:ligatures w14:val="none"/>
         </w:rPr>
-        <w:t xml:space="preserve">I feel like I communicated and collaborated with the team a lot because of my team lead role, Though I sometimes felt like I was dominating some discussions because I am passionate and the leader for the first time </w:t>
+        <w:t xml:space="preserve">I feel like I communicated and collaborated with the team a lot because of my team lead role, Though I sometimes felt like I was dominating some discussions </w:t>
+      </w:r>
+      <w:r>
+        <w:rPr>
+          <w:rFonts w:ascii="Arial" w:eastAsia="Times New Roman" w:hAnsi="Arial" w:cs="Arial"/>
+          <w:kern w:val="0"/>
+          <w:sz w:val="22"/>
+          <w:szCs w:val="22"/>
+          <w:lang w:eastAsia="en-GB"/>
+          <w14:ligatures w14:val="none"/>
+        </w:rPr>
+        <w:t xml:space="preserve">/ taking up too much space </w:t>
+      </w:r>
+      <w:r>
+        <w:rPr>
+          <w:rFonts w:ascii="Arial" w:eastAsia="Times New Roman" w:hAnsi="Arial" w:cs="Arial"/>
+          <w:kern w:val="0"/>
+          <w:sz w:val="22"/>
+          <w:szCs w:val="22"/>
+          <w:lang w:eastAsia="en-GB"/>
+          <w14:ligatures w14:val="none"/>
+        </w:rPr>
+        <w:t xml:space="preserve">this is probably because I am not used to it though I did wish to mention it. </w:t>
       </w:r>
     </w:p>
     <w:p>
@@ -2568,19 +2588,17 @@
         </w:rPr>
         <w:t xml:space="preserve">I feel like I didn’t have many issues with the </w:t>
       </w:r>
-      <w:proofErr w:type="gramStart"/>
-      <w:r>
-        <w:rPr>
-          <w:rFonts w:ascii="Arial" w:eastAsia="Times New Roman" w:hAnsi="Arial" w:cs="Arial"/>
-          <w:kern w:val="0"/>
-          <w:sz w:val="22"/>
-          <w:szCs w:val="22"/>
-          <w:lang w:eastAsia="en-GB"/>
-          <w14:ligatures w14:val="none"/>
-        </w:rPr>
-        <w:t>team</w:t>
-      </w:r>
-      <w:proofErr w:type="gramEnd"/>
+      <w:r>
+        <w:rPr>
+          <w:rFonts w:ascii="Arial" w:eastAsia="Times New Roman" w:hAnsi="Arial" w:cs="Arial"/>
+          <w:kern w:val="0"/>
+          <w:sz w:val="22"/>
+          <w:szCs w:val="22"/>
+          <w:lang w:eastAsia="en-GB"/>
+          <w14:ligatures w14:val="none"/>
+        </w:rPr>
+        <w:t>team,</w:t>
+      </w:r>
       <w:r>
         <w:rPr>
           <w:rFonts w:ascii="Arial" w:eastAsia="Times New Roman" w:hAnsi="Arial" w:cs="Arial"/>
@@ -2742,47 +2760,73 @@
           <w:lang w:eastAsia="en-GB"/>
           <w14:ligatures w14:val="none"/>
         </w:rPr>
-        <w:t>……………………………………………………………………………………………………………</w:t>
-      </w:r>
-      <w:r>
-        <w:rPr>
-          <w:rFonts w:ascii="Times New Roman" w:eastAsia="Times New Roman" w:hAnsi="Times New Roman" w:cs="Times New Roman"/>
-          <w:kern w:val="0"/>
-          <w:lang w:eastAsia="en-GB"/>
-          <w14:ligatures w14:val="none"/>
-        </w:rPr>
-        <w:br/>
-      </w:r>
-      <w:r>
-        <w:rPr>
-          <w:rFonts w:ascii="Arial" w:eastAsia="Times New Roman" w:hAnsi="Arial" w:cs="Arial"/>
-          <w:kern w:val="0"/>
-          <w:sz w:val="22"/>
-          <w:szCs w:val="22"/>
-          <w:lang w:eastAsia="en-GB"/>
-          <w14:ligatures w14:val="none"/>
-        </w:rPr>
-        <w:t>……………………………………………………………………………………………………………</w:t>
-      </w:r>
-      <w:r>
-        <w:rPr>
-          <w:rFonts w:ascii="Times New Roman" w:eastAsia="Times New Roman" w:hAnsi="Times New Roman" w:cs="Times New Roman"/>
-          <w:kern w:val="0"/>
-          <w:lang w:eastAsia="en-GB"/>
-          <w14:ligatures w14:val="none"/>
-        </w:rPr>
-        <w:br/>
-      </w:r>
-      <w:r>
-        <w:rPr>
-          <w:rFonts w:ascii="Arial" w:eastAsia="Times New Roman" w:hAnsi="Arial" w:cs="Arial"/>
-          <w:kern w:val="0"/>
-          <w:sz w:val="22"/>
-          <w:szCs w:val="22"/>
-          <w:lang w:eastAsia="en-GB"/>
-          <w14:ligatures w14:val="none"/>
-        </w:rPr>
-        <w:t>……………………………………………………………………………………………………………</w:t>
+        <w:t xml:space="preserve">Almost all feedback was extremely positive. In all of my feedback forms I ticked all the boxes regarding communication </w:t>
+      </w:r>
+      <w:r>
+        <w:rPr>
+          <w:rFonts w:ascii="Arial" w:eastAsia="Times New Roman" w:hAnsi="Arial" w:cs="Arial"/>
+          <w:kern w:val="0"/>
+          <w:sz w:val="22"/>
+          <w:szCs w:val="22"/>
+          <w:lang w:eastAsia="en-GB"/>
+          <w14:ligatures w14:val="none"/>
+        </w:rPr>
+        <w:t>overall there weren’t many boxes left unticked (</w:t>
+      </w:r>
+      <w:r>
+        <w:rPr>
+          <w:rFonts w:ascii="Arial" w:eastAsia="Times New Roman" w:hAnsi="Arial" w:cs="Arial"/>
+          <w:kern w:val="0"/>
+          <w:sz w:val="22"/>
+          <w:szCs w:val="22"/>
+          <w:lang w:eastAsia="en-GB"/>
+          <w14:ligatures w14:val="none"/>
+        </w:rPr>
+        <w:t>except</w:t>
+      </w:r>
+      <w:r>
+        <w:rPr>
+          <w:rFonts w:ascii="Arial" w:eastAsia="Times New Roman" w:hAnsi="Arial" w:cs="Arial"/>
+          <w:kern w:val="0"/>
+          <w:sz w:val="22"/>
+          <w:szCs w:val="22"/>
+          <w:lang w:eastAsia="en-GB"/>
+          <w14:ligatures w14:val="none"/>
+        </w:rPr>
+        <w:t xml:space="preserve"> for the bad ones) </w:t>
+      </w:r>
+      <w:r>
+        <w:rPr>
+          <w:rFonts w:ascii="Arial" w:eastAsia="Times New Roman" w:hAnsi="Arial" w:cs="Arial"/>
+          <w:kern w:val="0"/>
+          <w:sz w:val="22"/>
+          <w:szCs w:val="22"/>
+          <w:lang w:eastAsia="en-GB"/>
+          <w14:ligatures w14:val="none"/>
+        </w:rPr>
+        <w:t>which</w:t>
+      </w:r>
+      <w:r>
+        <w:rPr>
+          <w:rFonts w:ascii="Arial" w:eastAsia="Times New Roman" w:hAnsi="Arial" w:cs="Arial"/>
+          <w:kern w:val="0"/>
+          <w:sz w:val="22"/>
+          <w:szCs w:val="22"/>
+          <w:lang w:eastAsia="en-GB"/>
+          <w14:ligatures w14:val="none"/>
+        </w:rPr>
+        <w:t xml:space="preserve"> was actually surprising. I know that I try really hard and I believe I did, but I was </w:t>
+      </w:r>
+      <w:r>
+        <w:rPr>
+          <w:rFonts w:ascii="Arial" w:eastAsia="Times New Roman" w:hAnsi="Arial" w:cs="Arial"/>
+          <w:kern w:val="0"/>
+          <w:sz w:val="22"/>
+          <w:szCs w:val="22"/>
+          <w:lang w:eastAsia="en-GB"/>
+          <w14:ligatures w14:val="none"/>
+        </w:rPr>
+        <w:t xml:space="preserve">somewhat scared that the team didn’t pick up on this, but they did and their feedback was nice to receive. I do believe my strengths are in my learning attitude and communication especially leading, this went really well. And I believe this was also seen within the feedback. Everyone liked the way I led the team and they all gave the reason of communication &amp; some planning.  </w:t>
       </w:r>
       <w:r>
         <w:rPr>
@@ -2911,56 +2955,70 @@
       </w:r>
     </w:p>
     <w:p>
-      <w:r>
-        <w:rPr>
-          <w:rFonts w:ascii="Arial" w:eastAsia="Times New Roman" w:hAnsi="Arial" w:cs="Arial"/>
-          <w:kern w:val="0"/>
-          <w:sz w:val="22"/>
-          <w:szCs w:val="22"/>
-          <w:lang w:eastAsia="en-GB"/>
-          <w14:ligatures w14:val="none"/>
-        </w:rPr>
-        <w:t>……………………………………………………………………………………………………………</w:t>
-      </w:r>
-      <w:r>
-        <w:rPr>
-          <w:rFonts w:ascii="Times New Roman" w:eastAsia="Times New Roman" w:hAnsi="Times New Roman" w:cs="Times New Roman"/>
-          <w:kern w:val="0"/>
-          <w:lang w:eastAsia="en-GB"/>
-          <w14:ligatures w14:val="none"/>
-        </w:rPr>
-        <w:br/>
-      </w:r>
-      <w:r>
-        <w:rPr>
-          <w:rFonts w:ascii="Arial" w:eastAsia="Times New Roman" w:hAnsi="Arial" w:cs="Arial"/>
-          <w:kern w:val="0"/>
-          <w:sz w:val="22"/>
-          <w:szCs w:val="22"/>
-          <w:lang w:eastAsia="en-GB"/>
-          <w14:ligatures w14:val="none"/>
-        </w:rPr>
-        <w:t>……………………………………………………………………………………………………………</w:t>
-      </w:r>
-      <w:r>
-        <w:rPr>
-          <w:rFonts w:ascii="Times New Roman" w:eastAsia="Times New Roman" w:hAnsi="Times New Roman" w:cs="Times New Roman"/>
-          <w:kern w:val="0"/>
-          <w:lang w:eastAsia="en-GB"/>
-          <w14:ligatures w14:val="none"/>
-        </w:rPr>
-        <w:br/>
-      </w:r>
-      <w:r>
-        <w:rPr>
-          <w:rFonts w:ascii="Arial" w:eastAsia="Times New Roman" w:hAnsi="Arial" w:cs="Arial"/>
-          <w:kern w:val="0"/>
-          <w:sz w:val="22"/>
-          <w:szCs w:val="22"/>
-          <w:lang w:eastAsia="en-GB"/>
-          <w14:ligatures w14:val="none"/>
-        </w:rPr>
-        <w:t>……………………………………………………………………………………………………………</w:t>
+      <w:pPr>
+        <w:rPr>
+          <w:rFonts w:ascii="Arial" w:eastAsia="Times New Roman" w:hAnsi="Arial" w:cs="Arial"/>
+          <w:kern w:val="0"/>
+          <w:sz w:val="22"/>
+          <w:szCs w:val="22"/>
+          <w:lang w:eastAsia="en-GB"/>
+          <w14:ligatures w14:val="none"/>
+        </w:rPr>
+      </w:pPr>
+      <w:r>
+        <w:rPr>
+          <w:rFonts w:ascii="Arial" w:eastAsia="Times New Roman" w:hAnsi="Arial" w:cs="Arial"/>
+          <w:kern w:val="0"/>
+          <w:sz w:val="22"/>
+          <w:szCs w:val="22"/>
+          <w:lang w:eastAsia="en-GB"/>
+          <w14:ligatures w14:val="none"/>
+        </w:rPr>
+        <w:t>Most of the feedback forms align with my self reflection.</w:t>
+      </w:r>
+      <w:r>
+        <w:rPr>
+          <w:rFonts w:ascii="Arial" w:eastAsia="Times New Roman" w:hAnsi="Arial" w:cs="Arial"/>
+          <w:kern w:val="0"/>
+          <w:sz w:val="22"/>
+          <w:szCs w:val="22"/>
+          <w:lang w:eastAsia="en-GB"/>
+          <w14:ligatures w14:val="none"/>
+        </w:rPr>
+        <w:t xml:space="preserve"> Ingmars feedback and my self reflection were almost identical. Dennis and Eden gave me a perfect score and selkies </w:t>
+      </w:r>
+      <w:r>
+        <w:rPr>
+          <w:rFonts w:ascii="Arial" w:eastAsia="Times New Roman" w:hAnsi="Arial" w:cs="Arial"/>
+          <w:kern w:val="0"/>
+          <w:sz w:val="22"/>
+          <w:szCs w:val="22"/>
+          <w:lang w:eastAsia="en-GB"/>
+          <w14:ligatures w14:val="none"/>
+        </w:rPr>
+        <w:t xml:space="preserve"> </w:t>
+      </w:r>
+      <w:r>
+        <w:rPr>
+          <w:rFonts w:ascii="Arial" w:eastAsia="Times New Roman" w:hAnsi="Arial" w:cs="Arial"/>
+          <w:kern w:val="0"/>
+          <w:sz w:val="22"/>
+          <w:szCs w:val="22"/>
+          <w:lang w:eastAsia="en-GB"/>
+          <w14:ligatures w14:val="none"/>
+        </w:rPr>
+        <w:t xml:space="preserve">feedback is the only one with a different perspective, though selkie did mention that the 2 spots that they didn’t tick that they didn’t have a lot of insight in. The biggest difference is I’d say in the communication where I thought I might take up too much space and they said that the space I took was actually nice and helped them. This luckily confirms that I am just </w:t>
+      </w:r>
+      <w:r>
+        <w:rPr>
+          <w:rFonts w:ascii="Arial" w:eastAsia="Times New Roman" w:hAnsi="Arial" w:cs="Arial"/>
+          <w:kern w:val="0"/>
+          <w:sz w:val="22"/>
+          <w:szCs w:val="22"/>
+          <w:lang w:eastAsia="en-GB"/>
+          <w14:ligatures w14:val="none"/>
+        </w:rPr>
+        <w:t xml:space="preserve">overthinking it and being too harsh on myself. </w:t>
       </w:r>
     </w:p>
     <w:p>
@@ -3092,47 +3150,18 @@
           <w:lang w:eastAsia="en-GB"/>
           <w14:ligatures w14:val="none"/>
         </w:rPr>
-        <w:t>……………………………………………………………………………………………………………</w:t>
-      </w:r>
-      <w:r>
-        <w:rPr>
-          <w:rFonts w:ascii="Times New Roman" w:eastAsia="Times New Roman" w:hAnsi="Times New Roman" w:cs="Times New Roman"/>
-          <w:kern w:val="0"/>
-          <w:lang w:eastAsia="en-GB"/>
-          <w14:ligatures w14:val="none"/>
-        </w:rPr>
-        <w:br/>
-      </w:r>
-      <w:r>
-        <w:rPr>
-          <w:rFonts w:ascii="Arial" w:eastAsia="Times New Roman" w:hAnsi="Arial" w:cs="Arial"/>
-          <w:kern w:val="0"/>
-          <w:sz w:val="22"/>
-          <w:szCs w:val="22"/>
-          <w:lang w:eastAsia="en-GB"/>
-          <w14:ligatures w14:val="none"/>
-        </w:rPr>
-        <w:t>……………………………………………………………………………………………………………</w:t>
-      </w:r>
-      <w:r>
-        <w:rPr>
-          <w:rFonts w:ascii="Times New Roman" w:eastAsia="Times New Roman" w:hAnsi="Times New Roman" w:cs="Times New Roman"/>
-          <w:kern w:val="0"/>
-          <w:lang w:eastAsia="en-GB"/>
-          <w14:ligatures w14:val="none"/>
-        </w:rPr>
-        <w:br/>
-      </w:r>
-      <w:r>
-        <w:rPr>
-          <w:rFonts w:ascii="Arial" w:eastAsia="Times New Roman" w:hAnsi="Arial" w:cs="Arial"/>
-          <w:kern w:val="0"/>
-          <w:sz w:val="22"/>
-          <w:szCs w:val="22"/>
-          <w:lang w:eastAsia="en-GB"/>
-          <w14:ligatures w14:val="none"/>
-        </w:rPr>
-        <w:t>……………………………………………………………………………………………………………</w:t>
+        <w:t xml:space="preserve">I learned a lot during this project. The feedback was really nice to read and was good for my confidence. I improved my hard skills a lot which was one of my goals for this year and I was a group lead for the first time as well. Being group lead went really well, and I am very happy about that. It was something that I already do naturally, and it is nice that it went well when I had the official title as well. Working in a team was already one of my strong suits, especially when it’s a group where I feel comfortable in. </w:t>
+      </w:r>
+      <w:r>
+        <w:rPr>
+          <w:rFonts w:ascii="Arial" w:eastAsia="Times New Roman" w:hAnsi="Arial" w:cs="Arial"/>
+          <w:kern w:val="0"/>
+          <w:sz w:val="22"/>
+          <w:szCs w:val="22"/>
+          <w:lang w:eastAsia="en-GB"/>
+          <w14:ligatures w14:val="none"/>
+        </w:rPr>
+        <w:t xml:space="preserve">Though there are still a few things I can improve on like over scoping (slightly) which I feel will come with time and experience and working highly efficiently though I am unsure on how to do this especially the working efficient al the time because of my mental illnesses as well. </w:t>
       </w:r>
       <w:r>
         <w:rPr>
@@ -3159,66 +3188,20 @@
     </w:p>
     <w:p>
       <w:pPr>
-        <w:pStyle w:val="Heading3"/>
-        <w:rPr>
-          <w:rFonts w:ascii="Arial" w:hAnsi="Arial" w:cs="Arial"/>
-          <w:b/>
-          <w:bCs/>
-          <w:color w:val="000000" w:themeColor="text1"/>
-          <w:sz w:val="22"/>
-          <w:szCs w:val="22"/>
-        </w:rPr>
-      </w:pPr>
-      <w:r>
-        <w:rPr>
-          <w:rFonts w:ascii="Arial" w:hAnsi="Arial" w:cs="Arial"/>
-          <w:b/>
-          <w:bCs/>
-          <w:color w:val="000000" w:themeColor="text1"/>
-          <w:sz w:val="22"/>
-          <w:szCs w:val="22"/>
-        </w:rPr>
+        <w:pStyle w:val="NoSpacing"/>
+      </w:pPr>
+      <w:r>
+        <w:lastRenderedPageBreak/>
         <w:t>L</w:t>
       </w:r>
       <w:r>
-        <w:rPr>
-          <w:rFonts w:ascii="Arial" w:hAnsi="Arial" w:cs="Arial"/>
-          <w:b/>
-          <w:bCs/>
-          <w:color w:val="000000" w:themeColor="text1"/>
-          <w:sz w:val="22"/>
-          <w:szCs w:val="22"/>
-        </w:rPr>
         <w:t>earning goals</w:t>
       </w:r>
       <w:r>
-        <w:rPr>
-          <w:rFonts w:ascii="Arial" w:hAnsi="Arial" w:cs="Arial"/>
-          <w:color w:val="000000" w:themeColor="text1"/>
-          <w:sz w:val="22"/>
-          <w:szCs w:val="22"/>
-        </w:rPr>
         <w:br/>
       </w:r>
       <w:r>
-        <w:rPr>
-          <w:rFonts w:ascii="Arial" w:hAnsi="Arial" w:cs="Arial"/>
-          <w:color w:val="000000" w:themeColor="text1"/>
-          <w:sz w:val="22"/>
-          <w:szCs w:val="22"/>
-        </w:rPr>
-        <w:t>Formulate</w:t>
-      </w:r>
-      <w:r>
-        <w:rPr>
-          <w:rFonts w:ascii="Arial" w:hAnsi="Arial" w:cs="Arial"/>
-          <w:b/>
-          <w:bCs/>
-          <w:color w:val="000000" w:themeColor="text1"/>
-          <w:sz w:val="22"/>
-          <w:szCs w:val="22"/>
-        </w:rPr>
-        <w:t xml:space="preserve"> </w:t>
+        <w:t xml:space="preserve">Formulate </w:t>
       </w:r>
       <w:r>
         <w:rPr>
@@ -3233,179 +3216,43 @@
         <w:t>concrete, behavioural goals</w:t>
       </w:r>
       <w:r>
-        <w:rPr>
-          <w:rFonts w:ascii="Arial" w:hAnsi="Arial" w:cs="Arial"/>
-          <w:b/>
-          <w:bCs/>
-          <w:color w:val="000000" w:themeColor="text1"/>
-          <w:sz w:val="22"/>
-          <w:szCs w:val="22"/>
-        </w:rPr>
         <w:t>.</w:t>
       </w:r>
       <w:r>
-        <w:rPr>
-          <w:rFonts w:ascii="Arial" w:hAnsi="Arial" w:cs="Arial"/>
-          <w:b/>
-          <w:bCs/>
-          <w:color w:val="000000" w:themeColor="text1"/>
-          <w:sz w:val="22"/>
-          <w:szCs w:val="22"/>
-        </w:rPr>
         <w:br/>
       </w:r>
       <w:r>
-        <w:rPr>
-          <w:rFonts w:ascii="Arial" w:hAnsi="Arial" w:cs="Arial"/>
-          <w:b/>
-          <w:bCs/>
-          <w:color w:val="000000" w:themeColor="text1"/>
-          <w:sz w:val="22"/>
-          <w:szCs w:val="22"/>
-        </w:rPr>
         <w:br/>
       </w:r>
       <w:r>
-        <w:rPr>
-          <w:rFonts w:ascii="Arial" w:eastAsia="Times New Roman" w:hAnsi="Arial" w:cs="Arial"/>
-          <w:kern w:val="0"/>
-          <w:sz w:val="22"/>
-          <w:szCs w:val="22"/>
-          <w:lang w:eastAsia="en-GB"/>
-          <w14:ligatures w14:val="none"/>
-        </w:rPr>
-        <w:t>……………………………………………………………………………………………………………</w:t>
-      </w:r>
-      <w:r>
-        <w:rPr>
-          <w:rFonts w:ascii="Times New Roman" w:eastAsia="Times New Roman" w:hAnsi="Times New Roman" w:cs="Times New Roman"/>
-          <w:kern w:val="0"/>
-          <w:lang w:eastAsia="en-GB"/>
-          <w14:ligatures w14:val="none"/>
-        </w:rPr>
-        <w:br/>
-      </w:r>
-      <w:r>
-        <w:rPr>
-          <w:rFonts w:ascii="Arial" w:eastAsia="Times New Roman" w:hAnsi="Arial" w:cs="Arial"/>
-          <w:kern w:val="0"/>
-          <w:sz w:val="22"/>
-          <w:szCs w:val="22"/>
-          <w:lang w:eastAsia="en-GB"/>
-          <w14:ligatures w14:val="none"/>
-        </w:rPr>
-        <w:t>……………………………………………………………………………………………………………</w:t>
-      </w:r>
-      <w:r>
-        <w:rPr>
-          <w:rFonts w:ascii="Times New Roman" w:eastAsia="Times New Roman" w:hAnsi="Times New Roman" w:cs="Times New Roman"/>
-          <w:kern w:val="0"/>
-          <w:lang w:eastAsia="en-GB"/>
-          <w14:ligatures w14:val="none"/>
-        </w:rPr>
-        <w:br/>
-      </w:r>
-      <w:r>
-        <w:rPr>
-          <w:rFonts w:ascii="Arial" w:eastAsia="Times New Roman" w:hAnsi="Arial" w:cs="Arial"/>
-          <w:kern w:val="0"/>
-          <w:sz w:val="22"/>
-          <w:szCs w:val="22"/>
-          <w:lang w:eastAsia="en-GB"/>
-          <w14:ligatures w14:val="none"/>
-        </w:rPr>
-        <w:t>……………………………………………………………………………………………………………</w:t>
-      </w:r>
-    </w:p>
-    <w:p/>
-    <w:p>
-      <w:pPr>
-        <w:spacing w:after="0" w:line="240" w:lineRule="auto"/>
-        <w:rPr>
-          <w:rFonts w:ascii="Arial" w:hAnsi="Arial" w:cs="Arial"/>
-          <w:b/>
-          <w:bCs/>
-          <w:color w:val="000000" w:themeColor="text1"/>
-          <w:sz w:val="22"/>
-          <w:szCs w:val="22"/>
-          <w:lang w:val="en-GB"/>
-        </w:rPr>
-      </w:pPr>
-      <w:r>
-        <w:rPr>
-          <w:rFonts w:ascii="Arial" w:hAnsi="Arial" w:cs="Arial"/>
-          <w:b/>
-          <w:bCs/>
-          <w:color w:val="000000" w:themeColor="text1"/>
-          <w:sz w:val="22"/>
-          <w:szCs w:val="22"/>
-          <w:lang w:val="en-GB"/>
-        </w:rPr>
-        <w:t xml:space="preserve">3. </w:t>
-      </w:r>
-      <w:r>
-        <w:rPr>
-          <w:rFonts w:ascii="Arial" w:hAnsi="Arial" w:cs="Arial"/>
-          <w:b/>
-          <w:bCs/>
-          <w:color w:val="000000" w:themeColor="text1"/>
-          <w:sz w:val="22"/>
-          <w:szCs w:val="22"/>
-          <w:lang w:val="en-GB"/>
-        </w:rPr>
-        <w:t>Upload</w:t>
+        <w:t>1.  for future projects I would like to think back to older projects and iterate upon them to adjust our scope based on that and gain more experience in scoping.</w:t>
       </w:r>
     </w:p>
     <w:p>
       <w:pPr>
-        <w:spacing w:after="0" w:line="240" w:lineRule="auto"/>
-        <w:rPr>
-          <w:rFonts w:ascii="Arial" w:hAnsi="Arial" w:cs="Arial"/>
-          <w:color w:val="029C82"/>
-          <w:sz w:val="22"/>
-          <w:szCs w:val="22"/>
-          <w:lang w:val="en-GB"/>
-        </w:rPr>
-      </w:pPr>
-      <w:r>
-        <w:rPr>
-          <w:rFonts w:ascii="Arial" w:hAnsi="Arial" w:cs="Arial"/>
-          <w:color w:val="000000" w:themeColor="text1"/>
-          <w:sz w:val="22"/>
-          <w:szCs w:val="22"/>
-          <w:lang w:val="en-GB"/>
-        </w:rPr>
-        <w:t>Upload</w:t>
-      </w:r>
-      <w:r>
-        <w:rPr>
-          <w:rFonts w:ascii="Arial" w:hAnsi="Arial" w:cs="Arial"/>
-          <w:color w:val="000000" w:themeColor="text1"/>
-          <w:sz w:val="22"/>
-          <w:szCs w:val="22"/>
-          <w:lang w:val="en-GB"/>
-        </w:rPr>
-        <w:t xml:space="preserve"> this form and the peer feedback forms you received to </w:t>
-      </w:r>
-      <w:r>
-        <w:rPr>
-          <w:rFonts w:ascii="Arial" w:hAnsi="Arial" w:cs="Arial"/>
-          <w:color w:val="000000" w:themeColor="text1"/>
-          <w:sz w:val="22"/>
-          <w:szCs w:val="22"/>
-          <w:lang w:val="en-GB"/>
-        </w:rPr>
-        <w:t>Bright Space</w:t>
-      </w:r>
-      <w:r>
-        <w:rPr>
-          <w:rFonts w:ascii="Arial" w:hAnsi="Arial" w:cs="Arial"/>
-          <w:color w:val="000000" w:themeColor="text1"/>
-          <w:sz w:val="22"/>
-          <w:szCs w:val="22"/>
-          <w:lang w:val="en-GB"/>
-        </w:rPr>
-        <w:t>.</w:t>
+        <w:pStyle w:val="ListParagraph"/>
+        <w:numPr>
+          <w:ilvl w:val="0"/>
+          <w:numId w:val="11"/>
+        </w:numPr>
+      </w:pPr>
+      <w:r>
+        <w:t xml:space="preserve">I would also like to work on </w:t>
+      </w:r>
+      <w:r>
+        <w:t>finding more of a balance between working consistently and being highly productive without overworking myself and becoming overwhelmed</w:t>
+      </w:r>
+    </w:p>
+    <w:p>
+      <w:pPr>
+        <w:pStyle w:val="ListParagraph"/>
+        <w:numPr>
+          <w:ilvl w:val="0"/>
+          <w:numId w:val="11"/>
+        </w:numPr>
+      </w:pPr>
+      <w:r>
+        <w:t xml:space="preserve">I would also like to keep being team lead and improving my skills in that aspect since it feels natural to me </w:t>
       </w:r>
     </w:p>
     <w:p/>
@@ -3643,7 +3490,7 @@
   <w:abstractNum w:abstractNumId="1" w15:restartNumberingAfterBreak="0">
     <w:nsid w:val="016B2298"/>
     <w:multiLevelType w:val="hybridMultilevel"/>
-    <w:tmpl w:val="0776BA40"/>
+    <w:tmpl w:val="BD9A74FC"/>
     <w:lvl w:ilvl="0" w:tplc="FFFFFFFF">
       <w:start w:val="1"/>
       <w:numFmt w:val="decimal"/>
@@ -3665,14 +3512,16 @@
         <w:rFonts w:ascii="Symbol" w:hAnsi="Symbol" w:hint="default"/>
       </w:rPr>
     </w:lvl>
-    <w:lvl w:ilvl="2" w:tplc="FFFFFFFF" w:tentative="1">
-      <w:start w:val="1"/>
-      <w:numFmt w:val="lowerRoman"/>
-      <w:lvlText w:val="%3."/>
-      <w:lvlJc w:val="right"/>
-      <w:pPr>
-        <w:ind w:left="2160" w:hanging="180"/>
-      </w:pPr>
+    <w:lvl w:ilvl="2" w:tplc="7BFA9E08">
+      <w:numFmt w:val="bullet"/>
+      <w:lvlText w:val="-"/>
+      <w:lvlJc w:val="left"/>
+      <w:pPr>
+        <w:ind w:left="2340" w:hanging="360"/>
+      </w:pPr>
+      <w:rPr>
+        <w:rFonts w:ascii="Aptos" w:eastAsiaTheme="minorHAnsi" w:hAnsi="Aptos" w:cstheme="minorBidi" w:hint="default"/>
+      </w:rPr>
     </w:lvl>
     <w:lvl w:ilvl="3" w:tplc="FFFFFFFF" w:tentative="1">
       <w:start w:val="1"/>
@@ -6025,6 +5874,15 @@
     <w:uiPriority w:val="99"/>
     <w:rsid w:val="00425293"/>
   </w:style>
+  <w:style w:type="paragraph" w:styleId="NoSpacing">
+    <w:name w:val="No Spacing"/>
+    <w:uiPriority w:val="1"/>
+    <w:qFormat/>
+    <w:rsid w:val="00AD33AD"/>
+    <w:pPr>
+      <w:spacing w:after="0" w:line="240" w:lineRule="auto"/>
+    </w:pPr>
+  </w:style>
 </w:styles>
 </file>
 

</xml_diff>